<commit_message>
vistoria: atualiza template marcado
Co-Authored-By: Claude Sonnet 4.6 <noreply@anthropic.com>
</commit_message>
<xml_diff>
--- a/docx_templates/VISTORIA_TEMPLATE1_marcado.docx
+++ b/docx_templates/VISTORIA_TEMPLATE1_marcado.docx
@@ -628,7 +628,18 @@
             </w:tcMar>
             <w:vAlign w:val="center"/>
           </w:tcPr>
-          <w:p/>
+          <w:p>
+            <w:r>
+              <w:rPr>
+                <w:b/>
+                <w:bCs/>
+                <w:color w:val="1A1A1A"/>
+                <w:sz w:val="18"/>
+                <w:szCs w:val="18"/>
+              </w:rPr>
+              <w:t>Combustível</w:t>
+            </w:r>
+          </w:p>
         </w:tc>
         <w:tc>
           <w:tcPr>
@@ -648,7 +659,34 @@
             </w:tcMar>
             <w:vAlign w:val="center"/>
           </w:tcPr>
-          <w:p/>
+          <w:p>
+            <w:r>
+              <w:rPr>
+                <w:color w:val="333333"/>
+                <w:sz w:val="18"/>
+                <w:szCs w:val="18"/>
+              </w:rPr>
+              <w:t>[</w:t>
+            </w:r>
+            <w:proofErr w:type="spellStart"/>
+            <w:r>
+              <w:rPr>
+                <w:color w:val="333333"/>
+                <w:sz w:val="18"/>
+                <w:szCs w:val="18"/>
+              </w:rPr>
+              <w:t>combustivel</w:t>
+            </w:r>
+            <w:proofErr w:type="spellEnd"/>
+            <w:r>
+              <w:rPr>
+                <w:color w:val="333333"/>
+                <w:sz w:val="18"/>
+                <w:szCs w:val="18"/>
+              </w:rPr>
+              <w:t>]</w:t>
+            </w:r>
+          </w:p>
         </w:tc>
       </w:tr>
       <w:tr>
@@ -1017,6 +1055,7 @@
             <w:vAlign w:val="center"/>
           </w:tcPr>
           <w:p>
+            <w:proofErr w:type="spellStart"/>
             <w:r>
               <w:rPr>
                 <w:b/>
@@ -1025,7 +1064,18 @@
                 <w:sz w:val="18"/>
                 <w:szCs w:val="18"/>
               </w:rPr>
-              <w:t>Data e Hora</w:t>
+              <w:t>Hodôm</w:t>
+            </w:r>
+            <w:proofErr w:type="spellEnd"/>
+            <w:r>
+              <w:rPr>
+                <w:b/>
+                <w:bCs/>
+                <w:color w:val="1A1A1A"/>
+                <w:sz w:val="18"/>
+                <w:szCs w:val="18"/>
+              </w:rPr>
+              <w:t>. Entrega</w:t>
             </w:r>
           </w:p>
         </w:tc>
@@ -1054,7 +1104,7 @@
                 <w:sz w:val="18"/>
                 <w:szCs w:val="18"/>
               </w:rPr>
-              <w:t>[data_hora]</w:t>
+              <w:t>[hodometro_entrega]</w:t>
             </w:r>
           </w:p>
         </w:tc>
@@ -1076,7 +1126,18 @@
             </w:tcMar>
             <w:vAlign w:val="center"/>
           </w:tcPr>
-          <w:p/>
+          <w:p>
+            <w:r>
+              <w:rPr>
+                <w:b/>
+                <w:bCs/>
+                <w:color w:val="1A1A1A"/>
+                <w:sz w:val="18"/>
+                <w:szCs w:val="18"/>
+              </w:rPr>
+              <w:t>Retorno</w:t>
+            </w:r>
+          </w:p>
         </w:tc>
         <w:tc>
           <w:tcPr>
@@ -1096,71 +1157,6 @@
             </w:tcMar>
             <w:vAlign w:val="center"/>
           </w:tcPr>
-          <w:p/>
-        </w:tc>
-      </w:tr>
-      <w:tr>
-        <w:tc>
-          <w:tcPr>
-            <w:tcW w:w="2200" w:type="dxa"/>
-            <w:tcBorders>
-              <w:top w:val="single" w:sz="1" w:space="0" w:color="AAAAAA"/>
-              <w:left w:val="single" w:sz="1" w:space="0" w:color="AAAAAA"/>
-              <w:bottom w:val="single" w:sz="1" w:space="0" w:color="AAAAAA"/>
-              <w:right w:val="single" w:sz="1" w:space="0" w:color="AAAAAA"/>
-            </w:tcBorders>
-            <w:shd w:val="clear" w:color="auto" w:fill="EAF1FB"/>
-            <w:tcMar>
-              <w:top w:w="80" w:type="dxa"/>
-              <w:left w:w="140" w:type="dxa"/>
-              <w:bottom w:w="80" w:type="dxa"/>
-              <w:right w:w="140" w:type="dxa"/>
-            </w:tcMar>
-            <w:vAlign w:val="center"/>
-          </w:tcPr>
-          <w:p>
-            <w:proofErr w:type="spellStart"/>
-            <w:r>
-              <w:rPr>
-                <w:b/>
-                <w:bCs/>
-                <w:color w:val="1A1A1A"/>
-                <w:sz w:val="18"/>
-                <w:szCs w:val="18"/>
-              </w:rPr>
-              <w:t>Hodôm</w:t>
-            </w:r>
-            <w:proofErr w:type="spellEnd"/>
-            <w:r>
-              <w:rPr>
-                <w:b/>
-                <w:bCs/>
-                <w:color w:val="1A1A1A"/>
-                <w:sz w:val="18"/>
-                <w:szCs w:val="18"/>
-              </w:rPr>
-              <w:t>. Entrega</w:t>
-            </w:r>
-          </w:p>
-        </w:tc>
-        <w:tc>
-          <w:tcPr>
-            <w:tcW w:w="3200" w:type="dxa"/>
-            <w:tcBorders>
-              <w:top w:val="single" w:sz="1" w:space="0" w:color="AAAAAA"/>
-              <w:left w:val="single" w:sz="1" w:space="0" w:color="AAAAAA"/>
-              <w:bottom w:val="single" w:sz="1" w:space="0" w:color="AAAAAA"/>
-              <w:right w:val="single" w:sz="1" w:space="0" w:color="AAAAAA"/>
-            </w:tcBorders>
-            <w:shd w:val="clear" w:color="auto" w:fill="FFFFFF"/>
-            <w:tcMar>
-              <w:top w:w="80" w:type="dxa"/>
-              <w:left w:w="140" w:type="dxa"/>
-              <w:bottom w:w="80" w:type="dxa"/>
-              <w:right w:w="140" w:type="dxa"/>
-            </w:tcMar>
-            <w:vAlign w:val="center"/>
-          </w:tcPr>
           <w:p>
             <w:r>
               <w:rPr>
@@ -1168,171 +1164,9 @@
                 <w:sz w:val="18"/>
                 <w:szCs w:val="18"/>
               </w:rPr>
-              <w:t>[hodometro_entrega]</w:t>
-            </w:r>
-          </w:p>
-        </w:tc>
-        <w:tc>
-          <w:tcPr>
-            <w:tcW w:w="1600" w:type="dxa"/>
-            <w:tcBorders>
-              <w:top w:val="single" w:sz="1" w:space="0" w:color="AAAAAA"/>
-              <w:left w:val="single" w:sz="1" w:space="0" w:color="AAAAAA"/>
-              <w:bottom w:val="single" w:sz="1" w:space="0" w:color="AAAAAA"/>
-              <w:right w:val="single" w:sz="1" w:space="0" w:color="AAAAAA"/>
-            </w:tcBorders>
-            <w:shd w:val="clear" w:color="auto" w:fill="EAF1FB"/>
-            <w:tcMar>
-              <w:top w:w="80" w:type="dxa"/>
-              <w:left w:w="140" w:type="dxa"/>
-              <w:bottom w:w="80" w:type="dxa"/>
-              <w:right w:w="140" w:type="dxa"/>
-            </w:tcMar>
-            <w:vAlign w:val="center"/>
-          </w:tcPr>
-          <w:p>
-            <w:r>
-              <w:rPr>
-                <w:b/>
-                <w:bCs/>
-                <w:color w:val="1A1A1A"/>
-                <w:sz w:val="18"/>
-                <w:szCs w:val="18"/>
-              </w:rPr>
-              <w:t>Retorno</w:t>
-            </w:r>
-          </w:p>
-        </w:tc>
-        <w:tc>
-          <w:tcPr>
-            <w:tcW w:w="2360" w:type="dxa"/>
-            <w:tcBorders>
-              <w:top w:val="single" w:sz="1" w:space="0" w:color="AAAAAA"/>
-              <w:left w:val="single" w:sz="1" w:space="0" w:color="AAAAAA"/>
-              <w:bottom w:val="single" w:sz="1" w:space="0" w:color="AAAAAA"/>
-              <w:right w:val="single" w:sz="1" w:space="0" w:color="AAAAAA"/>
-            </w:tcBorders>
-            <w:shd w:val="clear" w:color="auto" w:fill="FFFFFF"/>
-            <w:tcMar>
-              <w:top w:w="80" w:type="dxa"/>
-              <w:left w:w="140" w:type="dxa"/>
-              <w:bottom w:w="80" w:type="dxa"/>
-              <w:right w:w="140" w:type="dxa"/>
-            </w:tcMar>
-            <w:vAlign w:val="center"/>
-          </w:tcPr>
-          <w:p>
-            <w:r>
-              <w:rPr>
-                <w:color w:val="333333"/>
-                <w:sz w:val="18"/>
-                <w:szCs w:val="18"/>
-              </w:rPr>
               <w:t>[hodometro_retorno]</w:t>
             </w:r>
           </w:p>
-        </w:tc>
-      </w:tr>
-      <w:tr>
-        <w:tc>
-          <w:tcPr>
-            <w:tcW w:w="2200" w:type="dxa"/>
-            <w:tcBorders>
-              <w:top w:val="single" w:sz="1" w:space="0" w:color="AAAAAA"/>
-              <w:left w:val="single" w:sz="1" w:space="0" w:color="AAAAAA"/>
-              <w:bottom w:val="single" w:sz="1" w:space="0" w:color="AAAAAA"/>
-              <w:right w:val="single" w:sz="1" w:space="0" w:color="AAAAAA"/>
-            </w:tcBorders>
-            <w:shd w:val="clear" w:color="auto" w:fill="EAF1FB"/>
-            <w:tcMar>
-              <w:top w:w="80" w:type="dxa"/>
-              <w:left w:w="140" w:type="dxa"/>
-              <w:bottom w:w="80" w:type="dxa"/>
-              <w:right w:w="140" w:type="dxa"/>
-            </w:tcMar>
-            <w:vAlign w:val="center"/>
-          </w:tcPr>
-          <w:p>
-            <w:r>
-              <w:rPr>
-                <w:b/>
-                <w:bCs/>
-                <w:color w:val="1A1A1A"/>
-                <w:sz w:val="18"/>
-                <w:szCs w:val="18"/>
-              </w:rPr>
-              <w:t>Combustível</w:t>
-            </w:r>
-          </w:p>
-        </w:tc>
-        <w:tc>
-          <w:tcPr>
-            <w:tcW w:w="3200" w:type="dxa"/>
-            <w:tcBorders>
-              <w:top w:val="single" w:sz="1" w:space="0" w:color="AAAAAA"/>
-              <w:left w:val="single" w:sz="1" w:space="0" w:color="AAAAAA"/>
-              <w:bottom w:val="single" w:sz="1" w:space="0" w:color="AAAAAA"/>
-              <w:right w:val="single" w:sz="1" w:space="0" w:color="AAAAAA"/>
-            </w:tcBorders>
-            <w:shd w:val="clear" w:color="auto" w:fill="FFFFFF"/>
-            <w:tcMar>
-              <w:top w:w="80" w:type="dxa"/>
-              <w:left w:w="140" w:type="dxa"/>
-              <w:bottom w:w="80" w:type="dxa"/>
-              <w:right w:w="140" w:type="dxa"/>
-            </w:tcMar>
-            <w:vAlign w:val="center"/>
-          </w:tcPr>
-          <w:p>
-            <w:r>
-              <w:rPr>
-                <w:color w:val="333333"/>
-                <w:sz w:val="18"/>
-                <w:szCs w:val="18"/>
-              </w:rPr>
-              <w:t>[combustivel]</w:t>
-            </w:r>
-          </w:p>
-        </w:tc>
-        <w:tc>
-          <w:tcPr>
-            <w:tcW w:w="1600" w:type="dxa"/>
-            <w:tcBorders>
-              <w:top w:val="single" w:sz="1" w:space="0" w:color="AAAAAA"/>
-              <w:left w:val="single" w:sz="1" w:space="0" w:color="AAAAAA"/>
-              <w:bottom w:val="single" w:sz="1" w:space="0" w:color="AAAAAA"/>
-              <w:right w:val="single" w:sz="1" w:space="0" w:color="AAAAAA"/>
-            </w:tcBorders>
-            <w:shd w:val="clear" w:color="auto" w:fill="EAF1FB"/>
-            <w:tcMar>
-              <w:top w:w="80" w:type="dxa"/>
-              <w:left w:w="140" w:type="dxa"/>
-              <w:bottom w:w="80" w:type="dxa"/>
-              <w:right w:w="140" w:type="dxa"/>
-            </w:tcMar>
-            <w:vAlign w:val="center"/>
-          </w:tcPr>
-          <w:p/>
-        </w:tc>
-        <w:tc>
-          <w:tcPr>
-            <w:tcW w:w="2360" w:type="dxa"/>
-            <w:tcBorders>
-              <w:top w:val="single" w:sz="1" w:space="0" w:color="AAAAAA"/>
-              <w:left w:val="single" w:sz="1" w:space="0" w:color="AAAAAA"/>
-              <w:bottom w:val="single" w:sz="1" w:space="0" w:color="AAAAAA"/>
-              <w:right w:val="single" w:sz="1" w:space="0" w:color="AAAAAA"/>
-            </w:tcBorders>
-            <w:shd w:val="clear" w:color="auto" w:fill="FFFFFF"/>
-            <w:tcMar>
-              <w:top w:w="80" w:type="dxa"/>
-              <w:left w:w="140" w:type="dxa"/>
-              <w:bottom w:w="80" w:type="dxa"/>
-              <w:right w:w="140" w:type="dxa"/>
-            </w:tcMar>
-            <w:vAlign w:val="center"/>
-          </w:tcPr>
-          <w:p/>
         </w:tc>
       </w:tr>
     </w:tbl>
@@ -1491,12 +1325,12 @@
         <w:tblLook w:val="04A0" w:firstRow="1" w:lastRow="0" w:firstColumn="1" w:lastColumn="0" w:noHBand="0" w:noVBand="1"/>
       </w:tblPr>
       <w:tblGrid>
-        <w:gridCol w:w="2820"/>
-        <w:gridCol w:w="300"/>
-        <w:gridCol w:w="2820"/>
-        <w:gridCol w:w="300"/>
-        <w:gridCol w:w="2820"/>
-        <w:gridCol w:w="300"/>
+        <w:gridCol w:w="940"/>
+        <w:gridCol w:w="1891"/>
+        <w:gridCol w:w="1022"/>
+        <w:gridCol w:w="2061"/>
+        <w:gridCol w:w="1115"/>
+        <w:gridCol w:w="2331"/>
       </w:tblGrid>
       <w:tr>
         <w:tc>
@@ -3497,7 +3331,6 @@
           </w:tcPr>
           <w:p>
             <w:pPr>
-              <w:jc w:val="center"/>
               <w:rPr>
                 <w:color w:val="333333"/>
                 <w:sz w:val="18"/>
@@ -3586,7 +3419,6 @@
           </w:tcPr>
           <w:p>
             <w:pPr>
-              <w:jc w:val="center"/>
               <w:rPr>
                 <w:color w:val="333333"/>
                 <w:sz w:val="18"/>
@@ -3602,29 +3434,12 @@
               <w:t>[desc_sintomas]</w:t>
             </w:r>
           </w:p>
-          <w:p>
-            <w:pPr>
-              <w:jc w:val="center"/>
-            </w:pPr>
-          </w:p>
-          <w:p>
-            <w:pPr>
-              <w:jc w:val="center"/>
-            </w:pPr>
-          </w:p>
-          <w:p>
-            <w:pPr>
-              <w:jc w:val="center"/>
-            </w:pPr>
-          </w:p>
+          <w:p/>
+          <w:p/>
         </w:tc>
       </w:tr>
     </w:tbl>
-    <w:p>
-      <w:r>
-        <w:br w:type="page"/>
-      </w:r>
-    </w:p>
+    <w:p/>
     <w:p>
       <w:pPr>
         <w:pBdr>
@@ -4073,112 +3888,6 @@
         <w:tab/>
       </w:r>
     </w:p>
-    <w:tbl>
-      <w:tblPr>
-        <w:tblW w:w="9837" w:type="dxa"/>
-        <w:tblBorders>
-          <w:top w:val="single" w:sz="4" w:space="0" w:color="auto"/>
-          <w:left w:val="single" w:sz="4" w:space="0" w:color="auto"/>
-          <w:bottom w:val="single" w:sz="4" w:space="0" w:color="auto"/>
-          <w:right w:val="single" w:sz="4" w:space="0" w:color="auto"/>
-          <w:insideH w:val="single" w:sz="4" w:space="0" w:color="auto"/>
-          <w:insideV w:val="single" w:sz="4" w:space="0" w:color="auto"/>
-        </w:tblBorders>
-        <w:tblCellMar>
-          <w:left w:w="10" w:type="dxa"/>
-          <w:right w:w="10" w:type="dxa"/>
-        </w:tblCellMar>
-        <w:tblLook w:val="04A0" w:firstRow="1" w:lastRow="0" w:firstColumn="1" w:lastColumn="0" w:noHBand="0" w:noVBand="1"/>
-      </w:tblPr>
-      <w:tblGrid>
-        <w:gridCol w:w="9837"/>
-      </w:tblGrid>
-      <w:tr>
-        <w:trPr>
-          <w:trHeight w:val="3806"/>
-        </w:trPr>
-        <w:tc>
-          <w:tcPr>
-            <w:tcW w:w="9837" w:type="dxa"/>
-            <w:tcBorders>
-              <w:top w:val="single" w:sz="1" w:space="0" w:color="AAAAAA"/>
-              <w:left w:val="single" w:sz="1" w:space="0" w:color="AAAAAA"/>
-              <w:bottom w:val="single" w:sz="1" w:space="0" w:color="AAAAAA"/>
-              <w:right w:val="single" w:sz="1" w:space="0" w:color="AAAAAA"/>
-            </w:tcBorders>
-            <w:shd w:val="clear" w:color="auto" w:fill="F5F5F5"/>
-            <w:tcMar>
-              <w:top w:w="120" w:type="dxa"/>
-              <w:left w:w="120" w:type="dxa"/>
-              <w:bottom w:w="120" w:type="dxa"/>
-              <w:right w:w="120" w:type="dxa"/>
-            </w:tcMar>
-            <w:vAlign w:val="center"/>
-          </w:tcPr>
-          <w:p>
-            <w:pPr>
-              <w:spacing w:before="600" w:after="100"/>
-              <w:jc w:val="center"/>
-            </w:pPr>
-            <w:r>
-              <w:rPr>
-                <w:rFonts w:ascii="Segoe UI Emoji" w:eastAsia="Segoe UI Emoji" w:hAnsi="Segoe UI Emoji" w:cs="Segoe UI Emoji"/>
-                <w:sz w:val="56"/>
-                <w:szCs w:val="56"/>
-              </w:rPr>
-              <w:t>📷</w:t>
-            </w:r>
-          </w:p>
-          <w:p>
-            <w:pPr>
-              <w:spacing w:after="80"/>
-              <w:jc w:val="center"/>
-            </w:pPr>
-            <w:r>
-              <w:rPr>
-                <w:b/>
-                <w:bCs/>
-                <w:color w:val="555555"/>
-              </w:rPr>
-              <w:t>Foto de Danos / Avarias Internas</w:t>
-            </w:r>
-          </w:p>
-          <w:p>
-            <w:pPr>
-              <w:spacing w:after="600"/>
-              <w:jc w:val="center"/>
-            </w:pPr>
-            <w:r>
-              <w:rPr>
-                <w:color w:val="999999"/>
-                <w:sz w:val="16"/>
-                <w:szCs w:val="16"/>
-              </w:rPr>
-              <w:t>Insira aqui a foto ou utilize {</w:t>
-            </w:r>
-            <w:proofErr w:type="spellStart"/>
-            <w:r>
-              <w:rPr>
-                <w:color w:val="999999"/>
-                <w:sz w:val="16"/>
-                <w:szCs w:val="16"/>
-              </w:rPr>
-              <w:t>foto_danos</w:t>
-            </w:r>
-            <w:proofErr w:type="spellEnd"/>
-            <w:r>
-              <w:rPr>
-                <w:color w:val="999999"/>
-                <w:sz w:val="16"/>
-                <w:szCs w:val="16"/>
-              </w:rPr>
-              <w:t>}</w:t>
-            </w:r>
-          </w:p>
-        </w:tc>
-      </w:tr>
-    </w:tbl>
-    <w:p/>
     <w:sectPr>
       <w:pgSz w:w="11906" w:h="16838"/>
       <w:pgMar w:top="1000" w:right="1000" w:bottom="1000" w:left="1000" w:header="708" w:footer="708" w:gutter="0"/>

</xml_diff>